<commit_message>
Shorten and plainen Peng Gutachten; soften critique; base on thesis statements only
Co-Authored-By: Claude Fable 5.1 <noreply@anthropic.com>
Claude-Session: https://claude.ai/code/session_01Gi5d2orr7F6p1CbAVGokTZ
</commit_message>
<xml_diff>
--- a/peng_yuli_2026/Gutachten_Peng_Yuli_KAUST.docx
+++ b/peng_yuli_2026/Gutachten_Peng_Yuli_KAUST.docx
@@ -57,7 +57,7 @@
         <w:jc w:val="both"/>
       </w:pPr>
       <w:r>
-        <w:t xml:space="preserve">The doctoral thesis submitted by Yuli Peng investigates lateral flow assays (LFAs) for the rapid point-of-care detection of viral pathogens. LFAs, familiar from pregnancy and COVID-19 self-tests, are the most widely used rapid diagnostic format because they are cheap, instrument-free and can be read by eye. Conventional LFAs rely on full-length monoclonal antibodies, which have to be produced in mammalian cell culture and represent a major cost factor. The central idea of the thesis is to replace these antibodies by nanobodies, i.e., the isolated variable domains of camelid heavy-chain-only antibodies, which are only about 15 kDa in size, very stable, and can be produced recombinantly in </w:t>
+        <w:t xml:space="preserve">In her PhD work, Ms. Yuli Peng focused on lateral flow assays (LFAs) for the rapid detection of viral infections at the point of care. LFAs are known from pregnancy tests and COVID-19 self-tests. They are cheap, need no instrument and can be read by eye. Conventional LFAs use full-length antibodies, which are produced in mammalian cell culture and are the main cost factor of the test. The idea of the thesis is to replace these antibodies by nanobodies. Nanobodies are the isolated binding domains of camelid heavy-chain antibodies. They are about ten times smaller than an antibody, very stable and can be produced in </w:t>
       </w:r>
       <w:r>
         <w:rPr>
@@ -67,7 +67,7 @@
         <w:t xml:space="preserve">E. coli</w:t>
       </w:r>
       <w:r>
-        <w:t xml:space="preserve">. The research was conducted in the group of Prof. Magnus Rueping at the KAUST Catalysis Center under the day-to-day supervision of Dr. Dominik Renn, in part in collaboration with the groups of Prof. Stefan Arold and Dr. Raik Grünberg at KAUST.</w:t>
+        <w:t xml:space="preserve">. The work was carried out in the group of Prof. Magnus Rueping at the KAUST Catalysis Center. Dr. Dominik Renn is named as supervisor in the thesis and is co-author of all publications.</w:t>
       </w:r>
     </w:p>
     <w:p>
@@ -76,7 +76,7 @@
         <w:jc w:val="both"/>
       </w:pPr>
       <w:r>
-        <w:t xml:space="preserve">The thesis is clearly structured. It opens with a general introduction to lateral flow technology and a comprehensive, critical review of nanobody-based LFAs for viral diseases, which compiles all reports since 2014, relates the reported detection limits to the conditions under which they were obtained, and discusses the remaining barriers to translation, i.e., nanobody discovery and pairing, scalable production, conjugation, real-sample validation and regulation. This review is well written, shows a good command of the field and has been prepared as a review manuscript. The experimental work is then presented in three parts:</w:t>
+        <w:t xml:space="preserve">The thesis is well structured. The introduction gives an overview on lateral flow technology and a comprehensive review of nanobody-based LFAs for viral diseases. The review collects all reports since 2014, compares the reported detection limits and discusses the open problems of the field, i.e., finding suitable nanobody pairs, production, conjugation and validation with real samples. It is well written and shows a good understanding of the field. It has been prepared as a review manuscript. The experimental work consists of three parts:</w:t>
       </w:r>
     </w:p>
     <w:p>
@@ -85,17 +85,7 @@
         <w:jc w:val="both"/>
       </w:pPr>
       <w:r>
-        <w:t xml:space="preserve">(1) Respiratory viruses: Yuli Peng first establishes a recombinase polymerase amplification (RPA) assay for the nucleoprotein gene of respiratory syncytial virus (RSV) with lateral flow readout and demonstrates template-dependent detection of about 8 × 10³ plasmid copies. She then develops a nanobody-based LFA for the RSV prefusion F protein starting from four published nanobodies. The sandwich pair identified by ELISA initially failed in the LFA format, because direct conjugation of the nanobodies to gold nanoparticles (AuNPs) led to aggregation and false-positive signals. Site-specific biotinylation via an AviTag and attachment to streptavidin-AuNPs solved this problem and gave a detection limit of 100 ng/mL in buffer, simulated saliva and artificial nasopharyngeal fluid. The third study of this part, published in </w:t>
-      </w:r>
-      <w:r>
-        <w:rPr>
-          <w:i/>
-          <w:iCs/>
-        </w:rPr>
-        <w:t xml:space="preserve">ACS Synthetic Biology</w:t>
-      </w:r>
-      <w:r>
-        <w:t xml:space="preserve">, presents nanobody LFAs for the SARS-CoV-2 and MERS-CoV spike proteins in single and multiplexed format, including binding characterisation by microscale thermophoresis, optimisation of blocking and running buffers, detection of inactivated virus in spiked saliva, and a four-week stability study.</w:t>
+        <w:t xml:space="preserve">(1) Respiratory viruses: Ms. Peng first combined an isothermal nucleic acid amplification (RPA) with lateral flow readout for the detection of the respiratory syncytial virus (RSV) genome. She then developed a nanobody-based LFA for the RSV fusion protein using four published nanobodies. The nanobody pair identified by ELISA did not work on the strip at first, as direct conjugation to gold nanoparticles caused aggregation and false-positive signals. Ms. Peng solved this by site-specific biotinylation of the nanobody and attachment to streptavidin-coated gold nanoparticles. In the third study of this part, she developed LFAs for the spike proteins of SARS-CoV-2 and MERS-CoV, as single tests and as a multiplexed strip. This included the characterization of the binding affinities, the optimization of the strip components, tests with inactivated virus in saliva and a storage test.</w:t>
       </w:r>
     </w:p>
     <w:p>
@@ -104,17 +94,7 @@
         <w:jc w:val="both"/>
       </w:pPr>
       <w:r>
-        <w:t xml:space="preserve">(2) Vector-borne viruses: The second part extends the platform to flaviviruses. For dengue virus NS1, Yuli Peng introduces a modular assembly strategy in which SpyCatcher-fused nanobodies are biotinylated with a SpyTag-biotin peptide and captured on streptavidin-AuNPs. Using a biotin-4-fluorescein assay she shows that covalent coupling of streptavidin to carboxyl-AuNPs compromises its biotin-binding sites, an observation of practical value beyond this thesis. The resulting LFA detects NS1 of all four dengue serotypes in buffer, urine and diluted serum without cross-reactivity to Zika NS1. For Zika virus NS1 (published in </w:t>
-      </w:r>
-      <w:r>
-        <w:rPr>
-          <w:i/>
-          <w:iCs/>
-        </w:rPr>
-        <w:t xml:space="preserve">ACS Synthetic Biology</w:t>
-      </w:r>
-      <w:r>
-        <w:t xml:space="preserve">, shared first authorship with Atheer Alqatari) she compares cytoplasmic and periplasmic expression and different affinity tags and builds an LFA that detects NS1 down to 25 ng/mL in buffer, 20 ng/mL in serum and 1 ng/mL in urine, which is competitive with antibody-based tests. The accompanying biolayer interferometry and mass photometry analysis, contributed by the collaborators, shows how the oligomerisation of NS1 enhances its capture through avidity.</w:t>
+        <w:t xml:space="preserve">(2) Vector-borne viruses: The second part transfers the approach to dengue and Zika virus. For dengue, Ms. Peng developed a modular assembly in which the nanobodies carry a SpyCatcher domain, are biotinylated with a SpyTag peptide and are then captured on streptavidin-gold. She also showed why the streptavidin-gold conjugate prepared in the lab performed poorly: the coupling chemistry blocks part of the biotin binding sites. The final LFA detects the NS1 protein of all four dengue serotypes in buffer, urine and diluted serum and does not react with Zika NS1. For Zika, she compared different expression routes and tags for two published nanobodies and built an LFA that detects Zika NS1 in serum and urine, in urine down to 1 ng/mL. This is on the level of antibody-based tests. The binding kinetics and mass photometry measurements of this study were carried out by the collaborators and show that the oligomeric state of NS1 supports its capture on the strip.</w:t>
       </w:r>
     </w:p>
     <w:p>
@@ -123,7 +103,7 @@
         <w:jc w:val="both"/>
       </w:pPr>
       <w:r>
-        <w:t xml:space="preserve">(3) The thesis closes with a summary that draws the common lesson of all studies: nanobody affinity, conjugation chemistry and nanobody orientation are the decisive parameters, and a conjugation strategy that works for one nanobody cannot be transferred blindly to another.</w:t>
+        <w:t xml:space="preserve">(3) The thesis closes with a summary. The common finding of all studies is that the affinity of the nanobodies, the conjugation chemistry and the orientation of the nanobody on the gold particle decide whether a test works, and that a conjugation protocol that works for one nanobody does not necessarily work for the next.</w:t>
       </w:r>
     </w:p>
     <w:p>
@@ -132,7 +112,7 @@
         <w:jc w:val="both"/>
       </w:pPr>
       <w:r>
-        <w:t xml:space="preserve">The results of Ms. Peng led to the following peer-reviewed publications:</w:t>
+        <w:t xml:space="preserve">So far, the results of Ms. Peng led to two peer-reviewed research articles with her as first author:</w:t>
       </w:r>
     </w:p>
     <w:p>
@@ -145,7 +125,7 @@
         <w:spacing w:after="40"/>
       </w:pPr>
       <w:r>
-        <w:t xml:space="preserve">ACS Synth. Biol. 2025, 14, 420–430 (full paper, first author) – SARS-CoV-2 and MERS-CoV LFA</w:t>
+        <w:t xml:space="preserve">ACS Synth. Biol. 2025, 14, 420–430 (full paper, first author)</w:t>
       </w:r>
     </w:p>
     <w:p>
@@ -158,7 +138,7 @@
         <w:spacing w:after="40"/>
       </w:pPr>
       <w:r>
-        <w:t xml:space="preserve">ACS Synth. Biol. 2025, 14, 890–900 (full paper, first author, shared) – Zika virus LFA</w:t>
+        <w:t xml:space="preserve">ACS Synth. Biol. 2025, 14, 890–900 (full paper, first author, shared)</w:t>
       </w:r>
     </w:p>
     <w:p>
@@ -167,17 +147,7 @@
         <w:jc w:val="both"/>
       </w:pPr>
       <w:r>
-        <w:t xml:space="preserve">In addition, she is co-author of two methods articles in </w:t>
-      </w:r>
-      <w:r>
-        <w:rPr>
-          <w:i/>
-          <w:iCs/>
-        </w:rPr>
-        <w:t xml:space="preserve">Current Protocols</w:t>
-      </w:r>
-      <w:r>
-        <w:t xml:space="preserve"> (2025). A review on nanobody-based LFAs with Ms. Peng as first author has been prepared for submission, and two further manuscripts, on the dengue LFA (shared first author) and on an LFA protocol (first author), are in preparation.</w:t>
+        <w:t xml:space="preserve">Article (1) reports the SARS-CoV-2 and MERS-CoV LFA, article (2) the Zika LFA. She is co-author of two further articles in Current Protocols. A review with her as first author and two manuscripts on the dengue LFA (shared first author) and on an LFA protocol (first author) are in preparation.</w:t>
       </w:r>
     </w:p>
     <w:p>
@@ -186,17 +156,7 @@
         <w:jc w:val="both"/>
       </w:pPr>
       <w:r>
-        <w:t xml:space="preserve">Overall, the thesis represents a coherent and carefully executed body of applied research. Its strength lies less in conceptual novelty, since all nanobodies were taken from the literature, than in systematic assay engineering: Yuli Peng repeatedly diagnoses why a binder pair that works in ELISA fails on a strip and solves the problem through oriented, site-specific conjugation. She presents unsuccessful attempts as openly as successful ones, which makes the thesis a useful guide for anyone entering this field. It should be noted that, with the exception of the Zika assay, the detection limits achieved remain above those of commercial antibody-based tests, that all assays were validated with spiked matrices and inactivated virus rather than with clinical specimens, and that detection limits were determined by eye on single strips without statistical treatment. The candidate is aware of these limitations and discusses them appropriately in the respective chapters; the abstract of the coronavirus chapter is, however, somewhat more optimistic than the data. The manuscript also contains a number of typographical and cross-referencing errors and one factual error (chikungunya virus is assigned to the </w:t>
-      </w:r>
-      <w:r>
-        <w:rPr>
-          <w:i/>
-          <w:iCs/>
-        </w:rPr>
-        <w:t xml:space="preserve">Flaviviridae</w:t>
-      </w:r>
-      <w:r>
-        <w:t xml:space="preserve">), which should be corrected before final submission; a list is attached.</w:t>
+        <w:t xml:space="preserve">The thesis is a coherent and carefully carried out piece of applied research. Ms. Peng used published nanobodies and concentrated on turning them into working tests. She analyzed at each step why a test did not work and found a solution, mostly in the conjugation chemistry. She reports the failed attempts as openly as the successful ones. It could be noted that, apart from the Zika test, the detection limits are still above those of commercial antibody tests and that the tests were validated with spiked samples rather than patient samples. However, Ms. Peng is aware of this and discusses it in the respective chapters, and the aim of the thesis was to establish the platform rather than a finished product. The thesis contains a number of small errors, which should be corrected before final submission. A list is attached.</w:t>
       </w:r>
     </w:p>
     <w:p>
@@ -205,7 +165,7 @@
         <w:jc w:val="both"/>
       </w:pPr>
       <w:r>
-        <w:t xml:space="preserve">According to the authorship statement and to the information I received from the supervisory team, Ms. Peng carried out the development of the LFAs, from nanobody expression through conjugation to strip fabrication and validation, independently, while the conception of the individual projects was developed in close exchange with her supervisors, and the binding and mass photometry studies of the flavivirus projects were contributed by collaborators. Beyond her own projects she contributed protein expression and purification to two methods papers of the group and is first author of an LFA protocol manuscript with eight co-authors, which suggests that she established the lateral flow workflow in the laboratory and passed it on to others.</w:t>
+        <w:t xml:space="preserve">According to the authorship statement, Ms. Peng designed and carried out the LFA experiments herself, from nanobody expression to conjugation, strip fabrication and validation. Nanobody purification and binding measurements in the flavivirus projects were contributed by collaborators, and the corresponding parts of the text were written by them.</w:t>
       </w:r>
     </w:p>
     <w:p>

</xml_diff>

<commit_message>
Fix RSV plasmid wording, collaborator writing scope, Table 8 phrasing; add two errata
Co-Authored-By: Claude Fable 5.1 <noreply@anthropic.com>
Claude-Session: https://claude.ai/code/session_01Gi5d2orr7F6p1CbAVGokTZ
</commit_message>
<xml_diff>
--- a/peng_yuli_2026/Gutachten_Peng_Yuli_KAUST.docx
+++ b/peng_yuli_2026/Gutachten_Peng_Yuli_KAUST.docx
@@ -85,7 +85,7 @@
         <w:jc w:val="both"/>
       </w:pPr>
       <w:r>
-        <w:t xml:space="preserve">(1) Respiratory viruses: Ms. Peng first combined an isothermal nucleic acid amplification (RPA) with lateral flow readout for the detection of the respiratory syncytial virus (RSV) genome. She then developed a nanobody-based LFA for the RSV fusion protein using four published nanobodies. The nanobody pair identified by ELISA did not work on the strip at first, as direct conjugation to gold nanoparticles caused aggregation and false-positive signals. Ms. Peng solved this by site-specific biotinylation of the nanobody and attachment to streptavidin-coated gold nanoparticles. In the third study of this part, she developed LFAs for the spike proteins of SARS-CoV-2 and MERS-CoV, as single tests and as a multiplexed strip. This included the characterization of the binding affinities, the optimization of the strip components, tests with inactivated virus in saliva and a storage test.</w:t>
+        <w:t xml:space="preserve">(1) Respiratory viruses: Ms. Peng first combined an isothermal nucleic acid amplification (RPA) with lateral flow readout for the nucleoprotein gene of the respiratory syncytial virus (RSV). This assay was tested with plasmid DNA so far. She then developed a nanobody-based LFA for the RSV fusion protein using four published nanobodies. The nanobody pair identified by ELISA did not work on the strip at first, as direct conjugation to gold nanoparticles caused aggregation and false-positive signals. Ms. Peng solved this by site-specific biotinylation of the nanobody and attachment to streptavidin-coated gold nanoparticles. In the third study of this part, she developed LFAs for the spike proteins of SARS-CoV-2 and MERS-CoV, as single tests and as a multiplexed strip. This included the characterization of the binding affinities, the optimization of the strip components, tests with inactivated virus in saliva and a storage test.</w:t>
       </w:r>
     </w:p>
     <w:p>
@@ -165,7 +165,7 @@
         <w:jc w:val="both"/>
       </w:pPr>
       <w:r>
-        <w:t xml:space="preserve">According to the authorship statement, Ms. Peng designed and carried out the LFA experiments herself, from nanobody expression to conjugation, strip fabrication and validation. Nanobody purification and binding measurements in the flavivirus projects were contributed by collaborators, and the corresponding parts of the text were written by them.</w:t>
+        <w:t xml:space="preserve">According to the authorship statement, Ms. Peng designed and carried out the LFA experiments herself, from nanobody expression to conjugation, strip fabrication and validation. Nanobody purification and binding measurements in the flavivirus projects were contributed by collaborators, who also wrote the corresponding parts of the Zika chapter.</w:t>
       </w:r>
     </w:p>
     <w:p>
@@ -293,7 +293,20 @@
         <w:spacing w:after="40"/>
       </w:pPr>
       <w:r>
-        <w:t xml:space="preserve">p. 108: Figure 21 title "SAS-CoV-2".</w:t>
+        <w:t xml:space="preserve">p. 26: the table is referred to as "Table 1.1" instead of Table 1.</w:t>
+      </w:r>
+    </w:p>
+    <w:p>
+      <w:pPr>
+        <w:pStyle w:val="ListParagraph"/>
+        <w:numPr>
+          <w:ilvl w:val="0"/>
+          <w:numId w:val="3"/>
+        </w:numPr>
+        <w:spacing w:after="40"/>
+      </w:pPr>
+      <w:r>
+        <w:t xml:space="preserve">p. 108: Figure 21 title "SAS-CoV-2"; the same typo is in the List of Figures (p. 8).</w:t>
       </w:r>
     </w:p>
     <w:p>
@@ -368,7 +381,7 @@
         <w:spacing w:after="40"/>
       </w:pPr>
       <w:r>
-        <w:t xml:space="preserve">p. 127, Table 8: units (nM) are missing; the uncertainties are fitting errors and should be labelled as such.</w:t>
+        <w:t xml:space="preserve">p. 127, Table 8: units (nM) are missing. Are the uncertainties fitting errors or from replicate measurements? This should be stated.</w:t>
       </w:r>
     </w:p>
     <w:p>

</xml_diff>

<commit_message>
Experimental work has two parts, not three
Co-Authored-By: Claude Fable 5.1 <noreply@anthropic.com>
Claude-Session: https://claude.ai/code/session_01Gi5d2orr7F6p1CbAVGokTZ
</commit_message>
<xml_diff>
--- a/peng_yuli_2026/Gutachten_Peng_Yuli_KAUST.docx
+++ b/peng_yuli_2026/Gutachten_Peng_Yuli_KAUST.docx
@@ -76,7 +76,7 @@
         <w:jc w:val="both"/>
       </w:pPr>
       <w:r>
-        <w:t xml:space="preserve">The thesis is well structured. The introduction gives an overview on lateral flow technology and a comprehensive review of nanobody-based LFAs for viral diseases. The review collects all reports since 2014, compares the reported detection limits and discusses the open problems of the field, i.e., finding suitable nanobody pairs, production, conjugation and validation with real samples. It is well written and shows a good understanding of the field. It has been prepared as a review manuscript. The experimental work consists of three parts:</w:t>
+        <w:t xml:space="preserve">The thesis is well structured. The introduction gives an overview on lateral flow technology and a comprehensive review of nanobody-based LFAs for viral diseases. The review collects all reports since 2014, compares the reported detection limits and discusses the open problems of the field, i.e., finding suitable nanobody pairs, production, conjugation and validation with real samples. It is well written and shows a good understanding of the field. It has been prepared as a review manuscript. The experimental work consists of two parts:</w:t>
       </w:r>
     </w:p>
     <w:p>
@@ -103,7 +103,7 @@
         <w:jc w:val="both"/>
       </w:pPr>
       <w:r>
-        <w:t xml:space="preserve">(3) The thesis closes with a summary. The common finding of all studies is that the affinity of the nanobodies, the conjugation chemistry and the orientation of the nanobody on the gold particle decide whether a test works, and that a conjugation protocol that works for one nanobody does not necessarily work for the next.</w:t>
+        <w:t xml:space="preserve">The thesis closes with a summary. The common finding of all studies is that the affinity of the nanobodies, the conjugation chemistry and the orientation of the nanobody on the gold particle decide whether a test works, and that a conjugation protocol that works for one nanobody does not necessarily work for the next.</w:t>
       </w:r>
     </w:p>
     <w:p>

</xml_diff>